<commit_message>
Prepare manuscript package and analysis outputs for GitHub
</commit_message>
<xml_diff>
--- a/manuscript_package/main_manuscript/highlights.docx
+++ b/manuscript_package/main_manuscript/highlights.docx
@@ -17,7 +17,7 @@
         <w:jc w:val="left"/>
       </w:pPr>
       <w:r>
-        <w:t>Random row-level validation overstated predictive performance relative to grouped experiment-level and study-level validation.</w:t>
+        <w:t>Grouped validation cut performance relative to random row-level CV.</w:t>
       </w:r>
     </w:p>
     <w:p>
@@ -26,7 +26,7 @@
         <w:jc w:val="left"/>
       </w:pPr>
       <w:r>
-        <w:t>The neural baseline was strongest in-domain, whereas LightGBM was strongest for experiment-level transfer.</w:t>
+        <w:t>Study-level transfer remained weak across all tested models.</w:t>
       </w:r>
     </w:p>
     <w:p>
@@ -35,7 +35,7 @@
         <w:jc w:val="left"/>
       </w:pPr>
       <w:r>
-        <w:t>Study-level transfer remained weak for all tested models despite the stronger legacy training pipeline.</w:t>
+        <w:t>LGBM led experiment-level transfer, not study-level transfer.</w:t>
       </w:r>
     </w:p>
     <w:p>
@@ -44,7 +44,7 @@
         <w:jc w:val="left"/>
       </w:pPr>
       <w:r>
-        <w:t>Feature-importance rankings changed materially across coefficient, permutation, gain, and SHAP methods.</w:t>
+        <w:t>Null features exposed method-specific interpretation fragility.</w:t>
       </w:r>
     </w:p>
     <w:p>
@@ -53,7 +53,7 @@
         <w:jc w:val="left"/>
       </w:pPr>
       <w:r>
-        <w:t>Synthetic null features exposed substantial method differences in null suppression and stability without implying causality.</w:t>
+        <w:t>Stable rankings did not guarantee reliable feature importance.</w:t>
       </w:r>
     </w:p>
     <w:sectPr>

</xml_diff>